<commit_message>
style: format academic template with APA 7 and Times New Roman
</commit_message>
<xml_diff>
--- a/src/moodle_tasks/assets/academic-cover.docx
+++ b/src/moodle_tasks/assets/academic-cover.docx
@@ -5,7 +5,8 @@
     <w:p>
       <w:pPr>
         <w:keepNext w:val="0"/>
-        <w:spacing w:line="260" w:lineRule="exact" w:after="660"/>
+        <w:spacing w:line="480" w:lineRule="auto" w:after="480"/>
+        <w:ind w:firstLine="0"/>
         <w:jc w:val="center"/>
       </w:pPr>
       <w:r>
@@ -18,7 +19,8 @@
     <w:p>
       <w:pPr>
         <w:keepNext w:val="0"/>
-        <w:spacing w:line="260" w:lineRule="exact" w:after="200"/>
+        <w:spacing w:line="480" w:lineRule="auto" w:after="0"/>
+        <w:ind w:firstLine="0"/>
         <w:jc w:val="center"/>
       </w:pPr>
       <w:r>
@@ -31,7 +33,8 @@
     <w:p>
       <w:pPr>
         <w:keepNext w:val="0"/>
-        <w:spacing w:line="260" w:lineRule="exact" w:after="220"/>
+        <w:spacing w:line="480" w:lineRule="auto" w:after="0"/>
+        <w:ind w:firstLine="0"/>
         <w:jc w:val="center"/>
       </w:pPr>
       <w:r>
@@ -44,7 +47,8 @@
     <w:p>
       <w:pPr>
         <w:keepNext w:val="0"/>
-        <w:spacing w:line="260" w:lineRule="exact" w:after="220"/>
+        <w:spacing w:line="480" w:lineRule="auto" w:after="0"/>
+        <w:ind w:firstLine="0"/>
         <w:jc w:val="center"/>
       </w:pPr>
       <w:r>
@@ -57,7 +61,8 @@
     <w:p>
       <w:pPr>
         <w:keepNext w:val="0"/>
-        <w:spacing w:line="260" w:lineRule="exact" w:after="680"/>
+        <w:spacing w:line="480" w:lineRule="auto" w:after="480"/>
+        <w:ind w:firstLine="0"/>
         <w:jc w:val="center"/>
       </w:pPr>
       <w:r>
@@ -70,7 +75,8 @@
     <w:p>
       <w:pPr>
         <w:keepNext w:val="0"/>
-        <w:spacing w:line="260" w:lineRule="exact" w:after="220"/>
+        <w:spacing w:line="480" w:lineRule="auto" w:after="0"/>
+        <w:ind w:firstLine="0"/>
         <w:jc w:val="center"/>
       </w:pPr>
       <w:r>
@@ -83,7 +89,8 @@
     <w:p>
       <w:pPr>
         <w:keepNext w:val="0"/>
-        <w:spacing w:line="260" w:lineRule="exact" w:after="220"/>
+        <w:spacing w:line="480" w:lineRule="auto" w:after="0"/>
+        <w:ind w:firstLine="0"/>
         <w:jc w:val="center"/>
       </w:pPr>
       <w:r>
@@ -96,7 +103,8 @@
     <w:p>
       <w:pPr>
         <w:keepNext w:val="0"/>
-        <w:spacing w:line="260" w:lineRule="exact" w:after="700"/>
+        <w:spacing w:line="480" w:lineRule="auto" w:after="480"/>
+        <w:ind w:firstLine="0"/>
         <w:jc w:val="center"/>
       </w:pPr>
       <w:r>
@@ -109,7 +117,8 @@
     <w:p>
       <w:pPr>
         <w:keepNext w:val="0"/>
-        <w:spacing w:line="260" w:lineRule="exact" w:after="220"/>
+        <w:spacing w:line="480" w:lineRule="auto" w:after="0"/>
+        <w:ind w:firstLine="0"/>
         <w:jc w:val="center"/>
       </w:pPr>
       <w:r>
@@ -122,7 +131,8 @@
     <w:p>
       <w:pPr>
         <w:keepNext w:val="0"/>
-        <w:spacing w:line="260" w:lineRule="exact" w:after="700"/>
+        <w:spacing w:line="480" w:lineRule="auto" w:after="480"/>
+        <w:ind w:firstLine="0"/>
         <w:jc w:val="center"/>
       </w:pPr>
       <w:r>
@@ -135,7 +145,8 @@
     <w:p>
       <w:pPr>
         <w:keepNext w:val="0"/>
-        <w:spacing w:line="260" w:lineRule="exact" w:after="220"/>
+        <w:spacing w:line="480" w:lineRule="auto" w:after="0"/>
+        <w:ind w:firstLine="0"/>
         <w:jc w:val="center"/>
       </w:pPr>
       <w:r>
@@ -148,7 +159,8 @@
     <w:p>
       <w:pPr>
         <w:keepNext w:val="0"/>
-        <w:spacing w:line="260" w:lineRule="exact" w:after="200"/>
+        <w:spacing w:line="480" w:lineRule="auto" w:after="0"/>
+        <w:ind w:firstLine="0"/>
         <w:jc w:val="center"/>
       </w:pPr>
       <w:r>
@@ -161,7 +173,8 @@
     <w:p>
       <w:pPr>
         <w:keepNext w:val="0"/>
-        <w:spacing w:line="260" w:lineRule="exact" w:after="240"/>
+        <w:spacing w:line="480" w:lineRule="auto" w:after="0"/>
+        <w:ind w:firstLine="0"/>
         <w:jc w:val="center"/>
       </w:pPr>
       <w:r>
@@ -174,7 +187,8 @@
     <w:p>
       <w:pPr>
         <w:keepNext w:val="0"/>
-        <w:spacing w:line="260" w:lineRule="exact"/>
+        <w:spacing w:line="480" w:lineRule="auto"/>
+        <w:ind w:firstLine="0"/>
         <w:jc w:val="center"/>
       </w:pPr>
       <w:r>
@@ -187,8 +201,8 @@
     <w:sectPr>
       <w:headerReference w:type="default" r:id="rId9"/>
       <w:headerReference w:type="first" r:id="rId10"/>
-      <w:pgSz w:w="11906" w:h="16838"/>
-      <w:pgMar w:top="1640" w:right="1417" w:bottom="1417" w:left="1417" w:header="454" w:footer="720" w:gutter="0"/>
+      <w:pgSz w:w="12240" w:h="15840"/>
+      <w:pgMar w:top="1440" w:right="1440" w:bottom="1440" w:left="1440" w:header="720" w:footer="720" w:gutter="0"/>
       <w:cols w:space="720"/>
       <w:titlePg/>
       <w:docGrid w:linePitch="360"/>
@@ -202,14 +216,16 @@
   <w:p>
     <w:pPr>
       <w:pStyle w:val="Header"/>
-      <w:ind w:right="-1020"/>
+      <w:spacing w:line="240" w:lineRule="auto"/>
+      <w:ind w:firstLine="0"/>
       <w:jc w:val="right"/>
     </w:pPr>
     <w:fldSimple w:instr="PAGE">
       <w:r>
         <w:rPr>
-          <w:sz w:val="18"/>
-          <w:color w:val="808080"/>
+          <w:sz w:val="24"/>
+          <w:color w:val="000000"/>
+          <w:rFonts w:ascii="Times New Roman" w:hAnsi="Times New Roman"/>
         </w:rPr>
         <w:t>1</w:t>
       </w:r>
@@ -231,19 +247,23 @@
       <w:tblW w:type="auto" w:w="0"/>
       <w:tblLayout w:type="fixed"/>
       <w:tblLook w:firstColumn="1" w:firstRow="1" w:lastColumn="0" w:lastRow="0" w:noHBand="0" w:noVBand="1" w:val="04A0"/>
-      <w:tblInd w:w="-1020" w:type="dxa"/>
+      <w:tblInd w:w="0" w:type="dxa"/>
     </w:tblPr>
     <w:tblGrid>
-      <w:gridCol w:w="5556"/>
-      <w:gridCol w:w="5556"/>
+      <w:gridCol w:w="4680"/>
+      <w:gridCol w:w="4680"/>
     </w:tblGrid>
     <w:tr>
       <w:tc>
         <w:tcPr>
-          <w:tcW w:type="dxa" w:w="5556"/>
+          <w:tcW w:type="dxa" w:w="4680"/>
           <w:vAlign w:val="top"/>
         </w:tcPr>
         <w:p>
+          <w:pPr>
+            <w:spacing w:line="240" w:lineRule="auto"/>
+            <w:ind w:firstLine="0"/>
+          </w:pPr>
           <w:r>
             <w:drawing>
               <wp:inline xmlns:a="http://schemas.openxmlformats.org/drawingml/2006/main" xmlns:pic="http://schemas.openxmlformats.org/drawingml/2006/picture">
@@ -282,18 +302,21 @@
       </w:tc>
       <w:tc>
         <w:tcPr>
-          <w:tcW w:type="dxa" w:w="5556"/>
+          <w:tcW w:type="dxa" w:w="4680"/>
           <w:vAlign w:val="top"/>
         </w:tcPr>
         <w:p>
           <w:pPr>
+            <w:spacing w:line="240" w:lineRule="auto"/>
+            <w:ind w:firstLine="0"/>
             <w:jc w:val="right"/>
           </w:pPr>
           <w:fldSimple w:instr="PAGE">
             <w:r>
               <w:rPr>
-                <w:sz w:val="18"/>
-                <w:color w:val="808080"/>
+                <w:sz w:val="24"/>
+                <w:color w:val="000000"/>
+                <w:rFonts w:ascii="Times New Roman" w:hAnsi="Times New Roman"/>
               </w:rPr>
               <w:t>1</w:t>
             </w:r>
@@ -669,12 +692,14 @@
     <w:qFormat/>
     <w:rsid w:val="00FC693F"/>
     <w:pPr>
-      <w:spacing w:after="0" w:line="240" w:lineRule="auto"/>
+      <w:spacing w:after="0" w:before="0" w:line="480" w:lineRule="auto"/>
+      <w:ind w:firstLine="720"/>
+      <w:jc w:val="left"/>
     </w:pPr>
     <w:rPr>
-      <w:rFonts w:ascii="Arial" w:hAnsi="Arial"/>
+      <w:rFonts w:ascii="Times New Roman" w:hAnsi="Times New Roman"/>
       <w:color w:val="000000"/>
-      <w:sz w:val="22"/>
+      <w:sz w:val="24"/>
     </w:rPr>
   </w:style>
   <w:style w:type="paragraph" w:styleId="Header">
@@ -732,15 +757,17 @@
     <w:pPr>
       <w:keepNext/>
       <w:keepLines/>
-      <w:spacing w:before="480" w:after="0"/>
+      <w:spacing w:before="0" w:after="0" w:line="480" w:lineRule="auto"/>
+      <w:ind w:firstLine="0"/>
+      <w:jc w:val="center"/>
       <w:outlineLvl w:val="0"/>
     </w:pPr>
     <w:rPr>
-      <w:rFonts w:asciiTheme="majorHAnsi" w:eastAsiaTheme="majorEastAsia" w:hAnsiTheme="majorHAnsi" w:cstheme="majorBidi" w:ascii="Arial" w:hAnsi="Arial"/>
+      <w:rFonts w:asciiTheme="majorHAnsi" w:eastAsiaTheme="majorEastAsia" w:hAnsiTheme="majorHAnsi" w:cstheme="majorBidi" w:ascii="Times New Roman" w:hAnsi="Times New Roman"/>
       <w:b/>
       <w:bCs/>
       <w:color w:val="000000"/>
-      <w:sz w:val="28"/>
+      <w:sz w:val="24"/>
       <w:szCs w:val="28"/>
     </w:rPr>
   </w:style>
@@ -756,15 +783,17 @@
     <w:pPr>
       <w:keepNext/>
       <w:keepLines/>
-      <w:spacing w:before="200" w:after="0"/>
+      <w:spacing w:before="0" w:after="0" w:line="480" w:lineRule="auto"/>
+      <w:ind w:firstLine="0"/>
+      <w:jc w:val="left"/>
       <w:outlineLvl w:val="1"/>
     </w:pPr>
     <w:rPr>
-      <w:rFonts w:asciiTheme="majorHAnsi" w:eastAsiaTheme="majorEastAsia" w:hAnsiTheme="majorHAnsi" w:cstheme="majorBidi" w:ascii="Arial" w:hAnsi="Arial"/>
+      <w:rFonts w:asciiTheme="majorHAnsi" w:eastAsiaTheme="majorEastAsia" w:hAnsiTheme="majorHAnsi" w:cstheme="majorBidi" w:ascii="Times New Roman" w:hAnsi="Times New Roman"/>
       <w:b/>
       <w:bCs/>
       <w:color w:val="000000"/>
-      <w:sz w:val="26"/>
+      <w:sz w:val="24"/>
       <w:szCs w:val="26"/>
     </w:rPr>
   </w:style>
@@ -780,14 +809,17 @@
     <w:pPr>
       <w:keepNext/>
       <w:keepLines/>
-      <w:spacing w:before="200" w:after="0"/>
+      <w:spacing w:before="0" w:after="0" w:line="480" w:lineRule="auto"/>
+      <w:ind w:firstLine="0"/>
+      <w:jc w:val="left"/>
       <w:outlineLvl w:val="2"/>
     </w:pPr>
     <w:rPr>
-      <w:rFonts w:asciiTheme="majorHAnsi" w:eastAsiaTheme="majorEastAsia" w:hAnsiTheme="majorHAnsi" w:cstheme="majorBidi" w:ascii="Arial" w:hAnsi="Arial"/>
+      <w:rFonts w:asciiTheme="majorHAnsi" w:eastAsiaTheme="majorEastAsia" w:hAnsiTheme="majorHAnsi" w:cstheme="majorBidi" w:ascii="Times New Roman" w:hAnsi="Times New Roman"/>
       <w:b/>
       <w:bCs/>
       <w:color w:val="000000"/>
+      <w:sz w:val="24"/>
     </w:rPr>
   </w:style>
   <w:style w:type="paragraph" w:styleId="Heading4">
@@ -1018,15 +1050,18 @@
     <w:qFormat/>
     <w:rsid w:val="00FC693F"/>
     <w:pPr>
-      <w:spacing w:after="300" w:line="240" w:lineRule="auto"/>
+      <w:spacing w:after="0" w:line="480" w:lineRule="auto" w:before="0"/>
+      <w:ind w:firstLine="0"/>
       <w:contextualSpacing/>
+      <w:jc w:val="center"/>
     </w:pPr>
     <w:rPr>
-      <w:rFonts w:asciiTheme="majorHAnsi" w:eastAsiaTheme="majorEastAsia" w:hAnsiTheme="majorHAnsi" w:cstheme="majorBidi" w:ascii="Arial" w:hAnsi="Arial"/>
+      <w:rFonts w:asciiTheme="majorHAnsi" w:eastAsiaTheme="majorEastAsia" w:hAnsiTheme="majorHAnsi" w:cstheme="majorBidi" w:ascii="Times New Roman" w:hAnsi="Times New Roman"/>
+      <w:b/>
       <w:color w:val="000000"/>
       <w:spacing w:val="5"/>
       <w:kern w:val="28"/>
-      <w:sz w:val="52"/>
+      <w:sz w:val="24"/>
       <w:szCs w:val="52"/>
     </w:rPr>
   </w:style>

</xml_diff>